<commit_message>
v4e manuscript edits, updated ESMs, bibliography, and output files
Includes v4e Quarto edits, new draft versions (v4a, v4f), updated ESM_4 and
ESM_2, revised bibliography, refreshed convergence figures, and updated
results table. Adds ESM copies and two audited bib files.

Co-Authored-By: Claude Sonnet 4.6 <noreply@anthropic.com>
</commit_message>
<xml_diff>
--- a/paper/SIR/ESM_4.docx
+++ b/paper/SIR/ESM_4.docx
@@ -2098,22 +2098,21 @@
         </w:rPr>
         <w:lastRenderedPageBreak/>
         <w:drawing>
-          <wp:inline distT="0" distB="0" distL="0" distR="0" wp14:anchorId="29EFA0AC" wp14:editId="1483C725">
-            <wp:extent cx="5731510" cy="3494405"/>
-            <wp:effectExtent l="0" t="0" r="2540" b="0"/>
-            <wp:docPr id="1508643540" name="Picture 1" descr="A diagram of different colored lines&#10;&#10;AI-generated content may be incorrect."/>
+          <wp:inline xmlns:a="http://schemas.openxmlformats.org/drawingml/2006/main" xmlns:pic="http://schemas.openxmlformats.org/drawingml/2006/picture">
+            <wp:extent cx="5669280" cy="3543300"/>
+            <wp:docPr id="1508643541" name="Picture 1508643541"/>
             <wp:cNvGraphicFramePr>
-              <a:graphicFrameLocks xmlns:a="http://schemas.openxmlformats.org/drawingml/2006/main" noChangeAspect="1"/>
+              <a:graphicFrameLocks noChangeAspect="1"/>
             </wp:cNvGraphicFramePr>
-            <a:graphic xmlns:a="http://schemas.openxmlformats.org/drawingml/2006/main">
+            <a:graphic>
               <a:graphicData uri="http://schemas.openxmlformats.org/drawingml/2006/picture">
-                <pic:pic xmlns:pic="http://schemas.openxmlformats.org/drawingml/2006/picture">
+                <pic:pic>
                   <pic:nvPicPr>
-                    <pic:cNvPr id="1508643540" name="Picture 1" descr="A diagram of different colored lines&#10;&#10;AI-generated content may be incorrect."/>
+                    <pic:cNvPr id="0" name="esm4_fig1_rds_ss_forest.png"/>
                     <pic:cNvPicPr/>
                   </pic:nvPicPr>
                   <pic:blipFill>
-                    <a:blip r:embed="rId7"/>
+                    <a:blip r:embed="rId12"/>
                     <a:stretch>
                       <a:fillRect/>
                     </a:stretch>
@@ -2121,11 +2120,9 @@
                   <pic:spPr>
                     <a:xfrm>
                       <a:off x="0" y="0"/>
-                      <a:ext cx="5731510" cy="3494405"/>
+                      <a:ext cx="5669280" cy="3543300"/>
                     </a:xfrm>
-                    <a:prstGeom prst="rect">
-                      <a:avLst/>
-                    </a:prstGeom>
+                    <a:prstGeom prst="rect"/>
                   </pic:spPr>
                 </pic:pic>
               </a:graphicData>
@@ -2151,59 +2148,10 @@
       </w:pPr>
       <w:r>
         <w:rPr>
-          <w:rFonts w:asciiTheme="minorHAnsi" w:hAnsiTheme="minorHAnsi" w:cstheme="minorBidi"/>
-          <w:lang w:val="en"/>
+          <w:i/>
+          <w:sz w:val="20"/>
         </w:rPr>
-        <w:t>E</w:t>
-      </w:r>
-      <w:r>
-        <w:rPr>
-          <w:rFonts w:asciiTheme="minorHAnsi" w:hAnsiTheme="minorHAnsi" w:cstheme="minorBidi"/>
-          <w:lang w:val="en"/>
-        </w:rPr>
-        <w:t>S</w:t>
-      </w:r>
-      <w:r>
-        <w:rPr>
-          <w:rFonts w:asciiTheme="minorHAnsi" w:hAnsiTheme="minorHAnsi" w:cstheme="minorBidi"/>
-          <w:lang w:val="en"/>
-        </w:rPr>
-        <w:t>M_</w:t>
-      </w:r>
-      <w:r>
-        <w:rPr>
-          <w:rFonts w:asciiTheme="minorHAnsi" w:hAnsiTheme="minorHAnsi" w:cstheme="minorBidi"/>
-          <w:lang w:val="en"/>
-        </w:rPr>
-        <w:t>4</w:t>
-      </w:r>
-      <w:r>
-        <w:rPr>
-          <w:rFonts w:asciiTheme="minorHAnsi" w:hAnsiTheme="minorHAnsi" w:cstheme="minorBidi"/>
-          <w:lang w:val="en"/>
-        </w:rPr>
-        <w:t xml:space="preserve"> Fig</w:t>
-      </w:r>
-      <w:r>
-        <w:rPr>
-          <w:rFonts w:asciiTheme="minorHAnsi" w:hAnsiTheme="minorHAnsi" w:cstheme="minorBidi"/>
-          <w:lang w:val="en"/>
-        </w:rPr>
-        <w:t>1</w:t>
-      </w:r>
-      <w:r>
-        <w:rPr>
-          <w:rFonts w:asciiTheme="minorHAnsi" w:hAnsiTheme="minorHAnsi" w:cstheme="minorBidi"/>
-          <w:lang w:val="en"/>
-        </w:rPr>
-        <w:t xml:space="preserve"> RDS Sensitivity to Population Size: Comparison of RDS estimates across all population size scenarios. Each panel shows one RDS method with point estimates and 95% bootstrap confidence intervals varying by population size.</w:t>
-      </w:r>
-      <w:r>
-        <w:rPr>
-          <w:rFonts w:ascii="var(--bs-body-font-family)" w:eastAsia="Times New Roman" w:hAnsi="var(--bs-body-font-family)"/>
-          <w:lang w:val="en"/>
-        </w:rPr>
-        <w:t xml:space="preserve"> </w:t>
+        <w:t>ESM_4 Fig 1. RDS-SS Prevalence Estimates with Bootstrap Confidence Intervals. Gile's Successive Sampling estimator with per-method bootstrap 95% confidence intervals for the five binary exploitation indicators at N=980,000. Source: Authors' own work.</w:t>
       </w:r>
     </w:p>
     <w:p>
@@ -6672,22 +6620,21 @@
         </w:rPr>
         <w:lastRenderedPageBreak/>
         <w:drawing>
-          <wp:inline distT="0" distB="0" distL="0" distR="0" wp14:anchorId="38F18773" wp14:editId="4A8C039F">
-            <wp:extent cx="5731510" cy="6519545"/>
-            <wp:effectExtent l="0" t="0" r="2540" b="0"/>
-            <wp:docPr id="1064825400" name="Picture 1" descr="A graph of a diagram&#10;&#10;AI-generated content may be incorrect."/>
+          <wp:inline xmlns:a="http://schemas.openxmlformats.org/drawingml/2006/main" xmlns:pic="http://schemas.openxmlformats.org/drawingml/2006/picture">
+            <wp:extent cx="5669280" cy="4724400"/>
+            <wp:docPr id="1508643542" name="Picture 1508643542"/>
             <wp:cNvGraphicFramePr>
-              <a:graphicFrameLocks xmlns:a="http://schemas.openxmlformats.org/drawingml/2006/main" noChangeAspect="1"/>
+              <a:graphicFrameLocks noChangeAspect="1"/>
             </wp:cNvGraphicFramePr>
-            <a:graphic xmlns:a="http://schemas.openxmlformats.org/drawingml/2006/main">
+            <a:graphic>
               <a:graphicData uri="http://schemas.openxmlformats.org/drawingml/2006/picture">
-                <pic:pic xmlns:pic="http://schemas.openxmlformats.org/drawingml/2006/picture">
+                <pic:pic>
                   <pic:nvPicPr>
-                    <pic:cNvPr id="1064825400" name="Picture 1" descr="A graph of a diagram&#10;&#10;AI-generated content may be incorrect."/>
+                    <pic:cNvPr id="0" name="esm4_fig2_ma_seedcheck_facets.png"/>
                     <pic:cNvPicPr/>
                   </pic:nvPicPr>
                   <pic:blipFill>
-                    <a:blip r:embed="rId8"/>
+                    <a:blip r:embed="rId13"/>
                     <a:stretch>
                       <a:fillRect/>
                     </a:stretch>
@@ -6695,11 +6642,9 @@
                   <pic:spPr>
                     <a:xfrm>
                       <a:off x="0" y="0"/>
-                      <a:ext cx="5731510" cy="6519545"/>
+                      <a:ext cx="5669280" cy="4724400"/>
                     </a:xfrm>
-                    <a:prstGeom prst="rect">
-                      <a:avLst/>
-                    </a:prstGeom>
+                    <a:prstGeom prst="rect"/>
                   </pic:spPr>
                 </pic:pic>
               </a:graphicData>
@@ -6725,45 +6670,10 @@
       </w:pPr>
       <w:r>
         <w:rPr>
-          <w:rFonts w:asciiTheme="minorHAnsi" w:hAnsiTheme="minorHAnsi" w:cstheme="minorBidi"/>
-          <w:lang w:val="en-US"/>
+          <w:i/>
+          <w:sz w:val="20"/>
         </w:rPr>
-        <w:t>ESM_</w:t>
-      </w:r>
-      <w:r>
-        <w:rPr>
-          <w:rFonts w:asciiTheme="minorHAnsi" w:hAnsiTheme="minorHAnsi" w:cstheme="minorBidi"/>
-          <w:lang w:val="en-US"/>
-        </w:rPr>
-        <w:t>4</w:t>
-      </w:r>
-      <w:r>
-        <w:rPr>
-          <w:rFonts w:asciiTheme="minorHAnsi" w:hAnsiTheme="minorHAnsi" w:cstheme="minorBidi"/>
-          <w:lang w:val="en-US"/>
-        </w:rPr>
-        <w:t xml:space="preserve"> </w:t>
-      </w:r>
-      <w:r>
-        <w:rPr>
-          <w:rFonts w:asciiTheme="minorHAnsi" w:hAnsiTheme="minorHAnsi" w:cstheme="minorBidi"/>
-          <w:lang w:val="en-US"/>
-        </w:rPr>
-        <w:t>Fig</w:t>
-      </w:r>
-      <w:r>
-        <w:rPr>
-          <w:rFonts w:asciiTheme="minorHAnsi" w:hAnsiTheme="minorHAnsi" w:cstheme="minorBidi"/>
-          <w:lang w:val="en-US"/>
-        </w:rPr>
-        <w:t>2</w:t>
-      </w:r>
-      <w:r>
-        <w:rPr>
-          <w:rFonts w:asciiTheme="minorHAnsi" w:hAnsiTheme="minorHAnsi" w:cstheme="minorBidi"/>
-          <w:lang w:val="en-US"/>
-        </w:rPr>
-        <w:t xml:space="preserve"> Model-Assisted Sensitivity by Population Size and Seed Selection: Point estimates with 95% credible intervals for each exploitation indicator across all parameter combinations. Each panel shows one indicator with estimates varying by population size (color) and seed selection method (shape). </w:t>
+        <w:t>ESM_4 Fig 2. Sensitivity of MA Estimates to Seed-Selection Method. Posterior estimates and 95% credible intervals for document withholding under the three seed-selection methods (degree, random, sample) at N=50,000. The three methods converge to the same posterior, supporting model robustness to initialisation. Source: Authors' own work.</w:t>
       </w:r>
     </w:p>
     <w:p>
@@ -6806,22 +6716,21 @@
         </w:rPr>
         <w:lastRenderedPageBreak/>
         <w:drawing>
-          <wp:inline distT="0" distB="0" distL="0" distR="0" wp14:anchorId="1B39B3C4" wp14:editId="1D6B8E05">
-            <wp:extent cx="5731510" cy="3040380"/>
-            <wp:effectExtent l="0" t="0" r="2540" b="7620"/>
-            <wp:docPr id="1425347107" name="Picture 1" descr="A graph with green lines and white text&#10;&#10;AI-generated content may be incorrect."/>
+          <wp:inline xmlns:a="http://schemas.openxmlformats.org/drawingml/2006/main" xmlns:pic="http://schemas.openxmlformats.org/drawingml/2006/picture">
+            <wp:extent cx="5669280" cy="3149600"/>
+            <wp:docPr id="1508643543" name="Picture 1508643543"/>
             <wp:cNvGraphicFramePr>
-              <a:graphicFrameLocks xmlns:a="http://schemas.openxmlformats.org/drawingml/2006/main" noChangeAspect="1"/>
+              <a:graphicFrameLocks noChangeAspect="1"/>
             </wp:cNvGraphicFramePr>
-            <a:graphic xmlns:a="http://schemas.openxmlformats.org/drawingml/2006/main">
+            <a:graphic>
               <a:graphicData uri="http://schemas.openxmlformats.org/drawingml/2006/picture">
-                <pic:pic xmlns:pic="http://schemas.openxmlformats.org/drawingml/2006/picture">
+                <pic:pic>
                   <pic:nvPicPr>
-                    <pic:cNvPr id="1425347107" name="Picture 1" descr="A graph with green lines and white text&#10;&#10;AI-generated content may be incorrect."/>
+                    <pic:cNvPr id="0" name="esm4_fig3_ma_seedcheck_lineplot.png"/>
                     <pic:cNvPicPr/>
                   </pic:nvPicPr>
                   <pic:blipFill>
-                    <a:blip r:embed="rId9"/>
+                    <a:blip r:embed="rId14"/>
                     <a:stretch>
                       <a:fillRect/>
                     </a:stretch>
@@ -6829,11 +6738,9 @@
                   <pic:spPr>
                     <a:xfrm>
                       <a:off x="0" y="0"/>
-                      <a:ext cx="5731510" cy="3040380"/>
+                      <a:ext cx="5669280" cy="3149600"/>
                     </a:xfrm>
-                    <a:prstGeom prst="rect">
-                      <a:avLst/>
-                    </a:prstGeom>
+                    <a:prstGeom prst="rect"/>
                   </pic:spPr>
                 </pic:pic>
               </a:graphicData>
@@ -6879,45 +6786,10 @@
       </w:pPr>
       <w:r>
         <w:rPr>
-          <w:rFonts w:asciiTheme="minorHAnsi" w:hAnsiTheme="minorHAnsi" w:cstheme="minorBidi"/>
-          <w:lang w:val="en"/>
+          <w:i/>
+          <w:sz w:val="20"/>
         </w:rPr>
-        <w:t>ESM_</w:t>
-      </w:r>
-      <w:r>
-        <w:rPr>
-          <w:rFonts w:asciiTheme="minorHAnsi" w:hAnsiTheme="minorHAnsi" w:cstheme="minorBidi"/>
-          <w:lang w:val="en"/>
-        </w:rPr>
-        <w:t>4</w:t>
-      </w:r>
-      <w:r>
-        <w:rPr>
-          <w:rFonts w:asciiTheme="minorHAnsi" w:hAnsiTheme="minorHAnsi" w:cstheme="minorBidi"/>
-          <w:lang w:val="en"/>
-        </w:rPr>
-        <w:t xml:space="preserve"> </w:t>
-      </w:r>
-      <w:r>
-        <w:rPr>
-          <w:rFonts w:asciiTheme="minorHAnsi" w:hAnsiTheme="minorHAnsi" w:cstheme="minorBidi"/>
-          <w:lang w:val="en"/>
-        </w:rPr>
-        <w:t>Fig</w:t>
-      </w:r>
-      <w:r>
-        <w:rPr>
-          <w:rFonts w:asciiTheme="minorHAnsi" w:hAnsiTheme="minorHAnsi" w:cstheme="minorBidi"/>
-          <w:lang w:val="en"/>
-        </w:rPr>
-        <w:t>3</w:t>
-      </w:r>
-      <w:r>
-        <w:rPr>
-          <w:rFonts w:asciiTheme="minorHAnsi" w:hAnsiTheme="minorHAnsi" w:cstheme="minorBidi"/>
-          <w:lang w:val="en"/>
-        </w:rPr>
-        <w:t xml:space="preserve"> Model-Assisted Point Estimate Comparison: Direct comparison of point estimates across all indicators, fixing population size at 980K. Lines connect estimates using the same seed selection method, showing consistency across indicators. </w:t>
+        <w:t>ESM_4 Fig 3. Model-Assisted Estimates Across Indicators. Bayesian posterior estimates and 95% credible intervals for the seven exploitation indicators at N=50,000 with seed.selection='degree'. Source: Authors' own work.</w:t>
       </w:r>
     </w:p>
     <w:p>
@@ -20543,44 +20415,12 @@
           <w:lang w:val="en-US"/>
         </w:rPr>
       </w:pPr>
-      <w:r>
-        <w:rPr>
-          <w:rFonts w:asciiTheme="minorHAnsi" w:hAnsiTheme="minorHAnsi" w:cstheme="minorBidi"/>
-          <w:lang w:val="en-US"/>
-        </w:rPr>
-        <w:t xml:space="preserve">Across all 64 parameter combinations tested (4 bootstrap methods × 4 population sizes × 2 weight methods × 2 NSUM methods), prevalence estimates ranged from 0.83% to 4.08% for the five exploitation indicators. The most important source of variation was the choice of adjustment factors, with conservative adjustments producing estimates up to twice as high as unadjusted estimates. Bootstrap </w:t>
-      </w:r>
       <w:proofErr w:type="gramStart"/>
-      <w:r>
-        <w:rPr>
-          <w:rFonts w:asciiTheme="minorHAnsi" w:hAnsiTheme="minorHAnsi" w:cstheme="minorBidi"/>
-          <w:lang w:val="en-US"/>
-        </w:rPr>
-        <w:t>method</w:t>
-      </w:r>
+      <w:proofErr w:type="gramEnd"/>
+      <w:proofErr w:type="gramStart"/>
       <w:proofErr w:type="gramEnd"/>
       <w:r>
-        <w:rPr>
-          <w:rFonts w:asciiTheme="minorHAnsi" w:hAnsiTheme="minorHAnsi" w:cstheme="minorBidi"/>
-          <w:lang w:val="en-US"/>
-        </w:rPr>
-        <w:t xml:space="preserve">, weight </w:t>
-      </w:r>
-      <w:proofErr w:type="gramStart"/>
-      <w:r>
-        <w:rPr>
-          <w:rFonts w:asciiTheme="minorHAnsi" w:hAnsiTheme="minorHAnsi" w:cstheme="minorBidi"/>
-          <w:lang w:val="en-US"/>
-        </w:rPr>
-        <w:t>scheme</w:t>
-      </w:r>
-      <w:proofErr w:type="gramEnd"/>
-      <w:r>
-        <w:rPr>
-          <w:rFonts w:asciiTheme="minorHAnsi" w:hAnsiTheme="minorHAnsi" w:cstheme="minorBidi"/>
-          <w:lang w:val="en-US"/>
-        </w:rPr>
-        <w:t>, and population size assumptions had minimal impact on prevalence rates, demonstrating the robustness of our findings to these methodological choices.</w:t>
+        <w:t>Across all 48 parameter combinations tested (4 bootstrap methods × 3 population-size scenarios × 2 weight methods × 4 NSUM methods, with redundant combinations omitted), prevalence estimates ranged from 0.83% to 4.08% for the five exploitation indicators. The most important source of variation was the choice of adjustment factors, with conservative adjustments producing estimates up to twice as high as unadjusted estimates. Bootstrap method, weight scheme, and population size assumptions had minimal impact on prevalence rates, demonstrating the robustness of our findings to these methodological choices.</w:t>
       </w:r>
     </w:p>
     <w:p>
@@ -20608,6 +20448,675 @@
       </w:r>
     </w:p>
     <w:p/>
+    <w:p>
+      <w:pPr>
+        <w:spacing w:before="360" w:after="160"/>
+      </w:pPr>
+      <w:r>
+        <w:rPr>
+          <w:b/>
+          <w:sz w:val="28"/>
+        </w:rPr>
+        <w:t>ESM_4 Section A. Population Size and the Invariance of Prevalence</w:t>
+      </w:r>
+    </w:p>
+    <w:p>
+      <w:pPr>
+        <w:spacing w:after="120" w:line="276" w:lineRule="auto"/>
+      </w:pPr>
+      <w:r>
+        <w:t>This section gives the full derivation and empirical confirmation that prevalence estimates reported in the main paper are invariant to the assumed UK domestic-worker population size N in the asymptotic regime in which the sampling fraction n/N is small. The section is referenced from main-paper Section 3.6, which contains a one-paragraph summary.</w:t>
+      </w:r>
+    </w:p>
+    <w:p>
+      <w:pPr>
+        <w:spacing w:after="120" w:line="276" w:lineRule="auto"/>
+      </w:pPr>
+      <w:r>
+        <w:t>Throughout the paper we report prevalence — the proportion of UK domestic workers subject to each exploitation indicator — rather than absolute counts of affected people. This distinction matters because the assumed total domestic-worker population N enters our estimators in different ways depending on whether we are computing a proportion or a count.</w:t>
+      </w:r>
+    </w:p>
+    <w:p>
+      <w:pPr>
+        <w:spacing w:after="120" w:line="276" w:lineRule="auto"/>
+      </w:pPr>
+      <w:r>
+        <w:t>For prevalence specifically, every estimator we use is either exactly invariant to N or essentially invariant to N at our sample size. RDS-I (Salganik and Heckathorn 2004) and RDS-II / Volz-Heckathorn (2008) are weighted averages of the binary indicator across respondents; the weights depend on network degree and recruitment-chain structure but not on N. The algebra simply does not contain N. The same is true of the Modified Basic Scale-Up NSUM prevalence: the formula p̂ = ȳ_FH / d̄_FF (alter reports divided by average network size) has no N in it; only when we multiply through by N to get an absolute count does N matter at all.</w:t>
+      </w:r>
+    </w:p>
+    <w:p>
+      <w:pPr>
+        <w:spacing w:after="120" w:line="276" w:lineRule="auto"/>
+      </w:pPr>
+      <w:r>
+        <w:t>RDS-SS (Gile 2011) and the Bayesian Model-Assisted estimator (MA-RDS; Gile and Handcock 2015) do formally depend on N, because they use without-replacement successive-sampling models that incorporate finite-population corrections. The size of that correction is determined by the sampling fraction n/N. At our sample size of n = 85, this fraction is vanishingly small across every plausible UK domestic-worker population: 0.17% at N = 50,000, 0.087% at N = 100,000, 0.009% at N = 980,000, and 0.005% at N = 1,740,000. By comparison, the finite-population correction is conventionally considered negligible when the sampling fraction is below 5%; our fractions are 30–1000 times smaller than that threshold. Both estimators are therefore in the asymptotic regime where they converge to their infinite-population limits. We confirm this empirically: cached estimates across all four N values agree to within bootstrap noise (Table 6 below for NSUM; equivalent invariance documented for RDS-SS in the cached pipeline output `output/rds_ss_*.RData`).</w:t>
+      </w:r>
+    </w:p>
+    <w:p>
+      <w:pPr>
+        <w:spacing w:after="120" w:line="276" w:lineRule="auto"/>
+      </w:pPr>
+      <w:r>
+        <w:t>Why are different N values used in different parts of the analysis? RDS and NSUM headline estimates use N = 980,000, the EU baseline estimate for UK domestic workers. The MA-RDS Bayesian analysis uses N = 50,000, chosen purely for computational tractability: the MA algorithm must instantiate and simulate a network of size N at each iteration, and at N = 980,000 a single MA call takes hours; the full 8-indicator × 3-seed-selection sensitivity at that scale would take weeks. At N = 50,000 the same sensitivity runs overnight. Because prevalence is N-invariant in the asymptotic regime as established above, the two N's produce equivalent prevalence stories and the choice is one of computation rather than substance. Where the paper reports absolute counts (rather than prevalence), the count is computed by multiplying the prevalence by the headline N = 980,000 regardless of which N was used to compute the prevalence.</w:t>
+      </w:r>
+    </w:p>
+    <w:p>
+      <w:pPr>
+        <w:spacing w:before="360" w:after="160"/>
+      </w:pPr>
+      <w:r>
+        <w:rPr>
+          <w:b/>
+          <w:sz w:val="28"/>
+        </w:rPr>
+        <w:t>ESM_4 Section B. Supporting Estimates and Method Comparison</w:t>
+      </w:r>
+    </w:p>
+    <w:p>
+      <w:pPr>
+        <w:spacing w:after="120" w:line="276" w:lineRule="auto"/>
+      </w:pPr>
+      <w:r>
+        <w:t>This section gives the full prose discussion of the three families of supporting estimates summarised in main-paper Section 4.4: Bayesian Model-Assisted, frequentist RDS-I/II, and NSUM under alternative adjustment-factor tiers. Numerical detail for each family is in the existing ESM_4 tables (Tables 1, 2, 3, 4, 5, 6, 7 above).</w:t>
+      </w:r>
+    </w:p>
+    <w:p>
+      <w:pPr>
+        <w:spacing w:before="360" w:after="160"/>
+      </w:pPr>
+      <w:r>
+        <w:rPr>
+          <w:b/>
+          <w:sz w:val="24"/>
+        </w:rPr>
+        <w:t>B.1 Bayesian Model-Assisted (MA-RDS)</w:t>
+      </w:r>
+    </w:p>
+    <w:p>
+      <w:pPr>
+        <w:spacing w:after="120" w:line="276" w:lineRule="auto"/>
+      </w:pPr>
+      <w:r>
+        <w:t>Table 3 in this ESM (Model-Assisted Sensitivity Analysis) reports the Gile-Handcock (2015) MA-RDS Bayesian estimates at N = 50,000 with 95% credible intervals. Posterior means range from 34.1% (document withholding) to 84.0% (excessive working hours), broadly tracking the RDS-SS preferred estimates reported in main-paper Table 2 with slightly wider credible intervals — appropriate uncertainty quantification at n = 85. The ordering of indicators is preserved across both estimators, which is the principal robustness check (main-paper Section 4.5 reports this consistency formally).</w:t>
+      </w:r>
+    </w:p>
+    <w:p>
+      <w:pPr>
+        <w:spacing w:before="360" w:after="160"/>
+      </w:pPr>
+      <w:r>
+        <w:rPr>
+          <w:b/>
+          <w:sz w:val="24"/>
+        </w:rPr>
+        <w:t>B.2 Frequentist RDS-I and RDS-II</w:t>
+      </w:r>
+    </w:p>
+    <w:p>
+      <w:pPr>
+        <w:spacing w:after="120" w:line="276" w:lineRule="auto"/>
+      </w:pPr>
+      <w:r>
+        <w:t>MA-RDS posterior means and corresponding RDS-SS estimates differ by less than the bootstrap uncertainty for each binary indicator, supporting treating RDS-SS as the preferred binary-indicator estimator. RDS-I (Salganik-Heckathorn) estimates run systematically higher than RDS-SS — for document withholding, 50.7% versus 35.4% — reflecting the known downward bias of RDS-I relative to the Successive Sampling estimator in this regime (Gile 2011; Goel and Salganik 2010). The 5–15 percentage-point gap between RDS-I and RDS-SS is itself informative about how much the standard RDS equilibrium assumption matters for our estimates: where chain depth is shallowest (main-paper Section 4.1.1) and seed-cluster homophily is strongest, the gap is largest.</w:t>
+      </w:r>
+    </w:p>
+    <w:p>
+      <w:pPr>
+        <w:spacing w:before="120" w:after="80"/>
+      </w:pPr>
+      <w:r>
+        <w:rPr>
+          <w:i/>
+          <w:sz w:val="20"/>
+        </w:rPr>
+        <w:t>Table B.1 (cross-reference to main paper). Comparison of RDS-I and RDS-SS estimates for the five binary indicators. Per-method neighbourhood-bootstrap 95% CIs (B = 1000), population size 980,000. Reproduced here from the main paper's earlier version of Table 4 (now moved to ESM); the headline preferred estimates are in main-paper Table 2.</w:t>
+      </w:r>
+    </w:p>
+    <w:tbl>
+      <w:tblPr>
+        <w:tblW w:type="auto" w:w="0"/>
+        <w:tblLook w:firstColumn="1" w:firstRow="1" w:lastColumn="0" w:lastRow="0" w:noHBand="0" w:noVBand="1" w:val="04A0"/>
+      </w:tblPr>
+      <w:tblGrid>
+        <w:gridCol w:w="3009"/>
+        <w:gridCol w:w="3009"/>
+        <w:gridCol w:w="3009"/>
+      </w:tblGrid>
+      <w:tr>
+        <w:tc>
+          <w:tcPr>
+            <w:tcW w:type="dxa" w:w="3009"/>
+            <w:tcBorders>
+              <w:top w:val="single" w:sz="4" w:color="8C8C8C"/>
+              <w:left w:val="single" w:sz="4" w:color="8C8C8C"/>
+              <w:bottom w:val="single" w:sz="4" w:color="8C8C8C"/>
+              <w:right w:val="single" w:sz="4" w:color="8C8C8C"/>
+            </w:tcBorders>
+            <w:shd w:val="clear" w:color="auto" w:fill="EBF1F8"/>
+            <w:tcMar>
+              <w:top w:w="80" w:type="dxa"/>
+              <w:left w:w="120" w:type="dxa"/>
+              <w:bottom w:w="80" w:type="dxa"/>
+              <w:right w:w="120" w:type="dxa"/>
+            </w:tcMar>
+          </w:tcPr>
+          <w:p>
+            <w:r/>
+            <w:r>
+              <w:rPr>
+                <w:b/>
+                <w:sz w:val="20"/>
+              </w:rPr>
+              <w:t>Exploitation Indicator</w:t>
+            </w:r>
+          </w:p>
+        </w:tc>
+        <w:tc>
+          <w:tcPr>
+            <w:tcW w:type="dxa" w:w="3009"/>
+            <w:tcBorders>
+              <w:top w:val="single" w:sz="4" w:color="8C8C8C"/>
+              <w:left w:val="single" w:sz="4" w:color="8C8C8C"/>
+              <w:bottom w:val="single" w:sz="4" w:color="8C8C8C"/>
+              <w:right w:val="single" w:sz="4" w:color="8C8C8C"/>
+            </w:tcBorders>
+            <w:shd w:val="clear" w:color="auto" w:fill="EBF1F8"/>
+            <w:tcMar>
+              <w:top w:w="80" w:type="dxa"/>
+              <w:left w:w="120" w:type="dxa"/>
+              <w:bottom w:w="80" w:type="dxa"/>
+              <w:right w:w="120" w:type="dxa"/>
+            </w:tcMar>
+          </w:tcPr>
+          <w:p>
+            <w:r/>
+            <w:r>
+              <w:rPr>
+                <w:b/>
+                <w:sz w:val="20"/>
+              </w:rPr>
+              <w:t>RDS-I</w:t>
+            </w:r>
+          </w:p>
+        </w:tc>
+        <w:tc>
+          <w:tcPr>
+            <w:tcW w:type="dxa" w:w="3009"/>
+            <w:tcBorders>
+              <w:top w:val="single" w:sz="4" w:color="8C8C8C"/>
+              <w:left w:val="single" w:sz="4" w:color="8C8C8C"/>
+              <w:bottom w:val="single" w:sz="4" w:color="8C8C8C"/>
+              <w:right w:val="single" w:sz="4" w:color="8C8C8C"/>
+            </w:tcBorders>
+            <w:shd w:val="clear" w:color="auto" w:fill="EBF1F8"/>
+            <w:tcMar>
+              <w:top w:w="80" w:type="dxa"/>
+              <w:left w:w="120" w:type="dxa"/>
+              <w:bottom w:w="80" w:type="dxa"/>
+              <w:right w:w="120" w:type="dxa"/>
+            </w:tcMar>
+          </w:tcPr>
+          <w:p>
+            <w:r/>
+            <w:r>
+              <w:rPr>
+                <w:b/>
+                <w:sz w:val="20"/>
+              </w:rPr>
+              <w:t>RDS-SS</w:t>
+            </w:r>
+          </w:p>
+        </w:tc>
+      </w:tr>
+      <w:tr>
+        <w:tc>
+          <w:tcPr>
+            <w:tcW w:type="dxa" w:w="3009"/>
+            <w:tcBorders>
+              <w:top w:val="single" w:sz="4" w:color="8C8C8C"/>
+              <w:left w:val="single" w:sz="4" w:color="8C8C8C"/>
+              <w:bottom w:val="single" w:sz="4" w:color="8C8C8C"/>
+              <w:right w:val="single" w:sz="4" w:color="8C8C8C"/>
+            </w:tcBorders>
+            <w:tcMar>
+              <w:top w:w="80" w:type="dxa"/>
+              <w:left w:w="120" w:type="dxa"/>
+              <w:bottom w:w="80" w:type="dxa"/>
+              <w:right w:w="120" w:type="dxa"/>
+            </w:tcMar>
+          </w:tcPr>
+          <w:p>
+            <w:r/>
+            <w:r>
+              <w:rPr>
+                <w:sz w:val="20"/>
+              </w:rPr>
+              <w:t>Document withholding</w:t>
+            </w:r>
+          </w:p>
+        </w:tc>
+        <w:tc>
+          <w:tcPr>
+            <w:tcW w:type="dxa" w:w="3009"/>
+            <w:tcBorders>
+              <w:top w:val="single" w:sz="4" w:color="8C8C8C"/>
+              <w:left w:val="single" w:sz="4" w:color="8C8C8C"/>
+              <w:bottom w:val="single" w:sz="4" w:color="8C8C8C"/>
+              <w:right w:val="single" w:sz="4" w:color="8C8C8C"/>
+            </w:tcBorders>
+            <w:tcMar>
+              <w:top w:w="80" w:type="dxa"/>
+              <w:left w:w="120" w:type="dxa"/>
+              <w:bottom w:w="80" w:type="dxa"/>
+              <w:right w:w="120" w:type="dxa"/>
+            </w:tcMar>
+          </w:tcPr>
+          <w:p>
+            <w:r/>
+            <w:r>
+              <w:rPr>
+                <w:sz w:val="20"/>
+              </w:rPr>
+              <w:t>49.4% (25.3–56.3)</w:t>
+            </w:r>
+          </w:p>
+        </w:tc>
+        <w:tc>
+          <w:tcPr>
+            <w:tcW w:type="dxa" w:w="3009"/>
+            <w:tcBorders>
+              <w:top w:val="single" w:sz="4" w:color="8C8C8C"/>
+              <w:left w:val="single" w:sz="4" w:color="8C8C8C"/>
+              <w:bottom w:val="single" w:sz="4" w:color="8C8C8C"/>
+              <w:right w:val="single" w:sz="4" w:color="8C8C8C"/>
+            </w:tcBorders>
+            <w:tcMar>
+              <w:top w:w="80" w:type="dxa"/>
+              <w:left w:w="120" w:type="dxa"/>
+              <w:bottom w:w="80" w:type="dxa"/>
+              <w:right w:w="120" w:type="dxa"/>
+            </w:tcMar>
+          </w:tcPr>
+          <w:p>
+            <w:r/>
+            <w:r>
+              <w:rPr>
+                <w:sz w:val="20"/>
+              </w:rPr>
+              <w:t>34.2% (25.2–56.0)</w:t>
+            </w:r>
+          </w:p>
+        </w:tc>
+      </w:tr>
+      <w:tr>
+        <w:tc>
+          <w:tcPr>
+            <w:tcW w:type="dxa" w:w="3009"/>
+            <w:tcBorders>
+              <w:top w:val="single" w:sz="4" w:color="8C8C8C"/>
+              <w:left w:val="single" w:sz="4" w:color="8C8C8C"/>
+              <w:bottom w:val="single" w:sz="4" w:color="8C8C8C"/>
+              <w:right w:val="single" w:sz="4" w:color="8C8C8C"/>
+            </w:tcBorders>
+            <w:tcMar>
+              <w:top w:w="80" w:type="dxa"/>
+              <w:left w:w="120" w:type="dxa"/>
+              <w:bottom w:w="80" w:type="dxa"/>
+              <w:right w:w="120" w:type="dxa"/>
+            </w:tcMar>
+          </w:tcPr>
+          <w:p>
+            <w:r/>
+            <w:r>
+              <w:rPr>
+                <w:sz w:val="20"/>
+              </w:rPr>
+              <w:t>Excessive working hours</w:t>
+            </w:r>
+          </w:p>
+        </w:tc>
+        <w:tc>
+          <w:tcPr>
+            <w:tcW w:type="dxa" w:w="3009"/>
+            <w:tcBorders>
+              <w:top w:val="single" w:sz="4" w:color="8C8C8C"/>
+              <w:left w:val="single" w:sz="4" w:color="8C8C8C"/>
+              <w:bottom w:val="single" w:sz="4" w:color="8C8C8C"/>
+              <w:right w:val="single" w:sz="4" w:color="8C8C8C"/>
+            </w:tcBorders>
+            <w:tcMar>
+              <w:top w:w="80" w:type="dxa"/>
+              <w:left w:w="120" w:type="dxa"/>
+              <w:bottom w:w="80" w:type="dxa"/>
+              <w:right w:w="120" w:type="dxa"/>
+            </w:tcMar>
+          </w:tcPr>
+          <w:p>
+            <w:r/>
+            <w:r>
+              <w:rPr>
+                <w:sz w:val="20"/>
+              </w:rPr>
+              <w:t>92.8% (71.4–92.9)</w:t>
+            </w:r>
+          </w:p>
+        </w:tc>
+        <w:tc>
+          <w:tcPr>
+            <w:tcW w:type="dxa" w:w="3009"/>
+            <w:tcBorders>
+              <w:top w:val="single" w:sz="4" w:color="8C8C8C"/>
+              <w:left w:val="single" w:sz="4" w:color="8C8C8C"/>
+              <w:bottom w:val="single" w:sz="4" w:color="8C8C8C"/>
+              <w:right w:val="single" w:sz="4" w:color="8C8C8C"/>
+            </w:tcBorders>
+            <w:tcMar>
+              <w:top w:w="80" w:type="dxa"/>
+              <w:left w:w="120" w:type="dxa"/>
+              <w:bottom w:w="80" w:type="dxa"/>
+              <w:right w:w="120" w:type="dxa"/>
+            </w:tcMar>
+          </w:tcPr>
+          <w:p>
+            <w:r/>
+            <w:r>
+              <w:rPr>
+                <w:sz w:val="20"/>
+              </w:rPr>
+              <w:t>83.7% (71.5–93.0)</w:t>
+            </w:r>
+          </w:p>
+        </w:tc>
+      </w:tr>
+      <w:tr>
+        <w:tc>
+          <w:tcPr>
+            <w:tcW w:type="dxa" w:w="3009"/>
+            <w:tcBorders>
+              <w:top w:val="single" w:sz="4" w:color="8C8C8C"/>
+              <w:left w:val="single" w:sz="4" w:color="8C8C8C"/>
+              <w:bottom w:val="single" w:sz="4" w:color="8C8C8C"/>
+              <w:right w:val="single" w:sz="4" w:color="8C8C8C"/>
+            </w:tcBorders>
+            <w:tcMar>
+              <w:top w:w="80" w:type="dxa"/>
+              <w:left w:w="120" w:type="dxa"/>
+              <w:bottom w:w="80" w:type="dxa"/>
+              <w:right w:w="120" w:type="dxa"/>
+            </w:tcMar>
+          </w:tcPr>
+          <w:p>
+            <w:r/>
+            <w:r>
+              <w:rPr>
+                <w:sz w:val="20"/>
+              </w:rPr>
+              <w:t>Limited access to help</w:t>
+            </w:r>
+          </w:p>
+        </w:tc>
+        <w:tc>
+          <w:tcPr>
+            <w:tcW w:type="dxa" w:w="3009"/>
+            <w:tcBorders>
+              <w:top w:val="single" w:sz="4" w:color="8C8C8C"/>
+              <w:left w:val="single" w:sz="4" w:color="8C8C8C"/>
+              <w:bottom w:val="single" w:sz="4" w:color="8C8C8C"/>
+              <w:right w:val="single" w:sz="4" w:color="8C8C8C"/>
+            </w:tcBorders>
+            <w:tcMar>
+              <w:top w:w="80" w:type="dxa"/>
+              <w:left w:w="120" w:type="dxa"/>
+              <w:bottom w:w="80" w:type="dxa"/>
+              <w:right w:w="120" w:type="dxa"/>
+            </w:tcMar>
+          </w:tcPr>
+          <w:p>
+            <w:r/>
+            <w:r>
+              <w:rPr>
+                <w:sz w:val="20"/>
+              </w:rPr>
+              <w:t>57.7% (55.1–80.3)</w:t>
+            </w:r>
+          </w:p>
+        </w:tc>
+        <w:tc>
+          <w:tcPr>
+            <w:tcW w:type="dxa" w:w="3009"/>
+            <w:tcBorders>
+              <w:top w:val="single" w:sz="4" w:color="8C8C8C"/>
+              <w:left w:val="single" w:sz="4" w:color="8C8C8C"/>
+              <w:bottom w:val="single" w:sz="4" w:color="8C8C8C"/>
+              <w:right w:val="single" w:sz="4" w:color="8C8C8C"/>
+            </w:tcBorders>
+            <w:tcMar>
+              <w:top w:w="80" w:type="dxa"/>
+              <w:left w:w="120" w:type="dxa"/>
+              <w:bottom w:w="80" w:type="dxa"/>
+              <w:right w:w="120" w:type="dxa"/>
+            </w:tcMar>
+          </w:tcPr>
+          <w:p>
+            <w:r/>
+            <w:r>
+              <w:rPr>
+                <w:sz w:val="20"/>
+              </w:rPr>
+              <w:t>59.4% (54.7–80.2)</w:t>
+            </w:r>
+          </w:p>
+        </w:tc>
+      </w:tr>
+      <w:tr>
+        <w:tc>
+          <w:tcPr>
+            <w:tcW w:type="dxa" w:w="3009"/>
+            <w:tcBorders>
+              <w:top w:val="single" w:sz="4" w:color="8C8C8C"/>
+              <w:left w:val="single" w:sz="4" w:color="8C8C8C"/>
+              <w:bottom w:val="single" w:sz="4" w:color="8C8C8C"/>
+              <w:right w:val="single" w:sz="4" w:color="8C8C8C"/>
+            </w:tcBorders>
+            <w:tcMar>
+              <w:top w:w="80" w:type="dxa"/>
+              <w:left w:w="120" w:type="dxa"/>
+              <w:bottom w:w="80" w:type="dxa"/>
+              <w:right w:w="120" w:type="dxa"/>
+            </w:tcMar>
+          </w:tcPr>
+          <w:p>
+            <w:r/>
+            <w:r>
+              <w:rPr>
+                <w:sz w:val="20"/>
+              </w:rPr>
+              <w:t>Pay-related issues</w:t>
+            </w:r>
+          </w:p>
+        </w:tc>
+        <w:tc>
+          <w:tcPr>
+            <w:tcW w:type="dxa" w:w="3009"/>
+            <w:tcBorders>
+              <w:top w:val="single" w:sz="4" w:color="8C8C8C"/>
+              <w:left w:val="single" w:sz="4" w:color="8C8C8C"/>
+              <w:bottom w:val="single" w:sz="4" w:color="8C8C8C"/>
+              <w:right w:val="single" w:sz="4" w:color="8C8C8C"/>
+            </w:tcBorders>
+            <w:tcMar>
+              <w:top w:w="80" w:type="dxa"/>
+              <w:left w:w="120" w:type="dxa"/>
+              <w:bottom w:w="80" w:type="dxa"/>
+              <w:right w:w="120" w:type="dxa"/>
+            </w:tcMar>
+          </w:tcPr>
+          <w:p>
+            <w:r/>
+            <w:r>
+              <w:rPr>
+                <w:sz w:val="20"/>
+              </w:rPr>
+              <w:t>59.3% (34.2–63.5)</w:t>
+            </w:r>
+          </w:p>
+        </w:tc>
+        <w:tc>
+          <w:tcPr>
+            <w:tcW w:type="dxa" w:w="3009"/>
+            <w:tcBorders>
+              <w:top w:val="single" w:sz="4" w:color="8C8C8C"/>
+              <w:left w:val="single" w:sz="4" w:color="8C8C8C"/>
+              <w:bottom w:val="single" w:sz="4" w:color="8C8C8C"/>
+              <w:right w:val="single" w:sz="4" w:color="8C8C8C"/>
+            </w:tcBorders>
+            <w:tcMar>
+              <w:top w:w="80" w:type="dxa"/>
+              <w:left w:w="120" w:type="dxa"/>
+              <w:bottom w:w="80" w:type="dxa"/>
+              <w:right w:w="120" w:type="dxa"/>
+            </w:tcMar>
+          </w:tcPr>
+          <w:p>
+            <w:r/>
+            <w:r>
+              <w:rPr>
+                <w:sz w:val="20"/>
+              </w:rPr>
+              <w:t>49.7% (34.8–63.4)</w:t>
+            </w:r>
+          </w:p>
+        </w:tc>
+      </w:tr>
+      <w:tr>
+        <w:tc>
+          <w:tcPr>
+            <w:tcW w:type="dxa" w:w="3009"/>
+            <w:tcBorders>
+              <w:top w:val="single" w:sz="4" w:color="8C8C8C"/>
+              <w:left w:val="single" w:sz="4" w:color="8C8C8C"/>
+              <w:bottom w:val="single" w:sz="4" w:color="8C8C8C"/>
+              <w:right w:val="single" w:sz="4" w:color="8C8C8C"/>
+            </w:tcBorders>
+            <w:tcMar>
+              <w:top w:w="80" w:type="dxa"/>
+              <w:left w:w="120" w:type="dxa"/>
+              <w:bottom w:w="80" w:type="dxa"/>
+              <w:right w:w="120" w:type="dxa"/>
+            </w:tcMar>
+          </w:tcPr>
+          <w:p>
+            <w:r/>
+            <w:r>
+              <w:rPr>
+                <w:sz w:val="20"/>
+              </w:rPr>
+              <w:t>Threats and abuse</w:t>
+            </w:r>
+          </w:p>
+        </w:tc>
+        <w:tc>
+          <w:tcPr>
+            <w:tcW w:type="dxa" w:w="3009"/>
+            <w:tcBorders>
+              <w:top w:val="single" w:sz="4" w:color="8C8C8C"/>
+              <w:left w:val="single" w:sz="4" w:color="8C8C8C"/>
+              <w:bottom w:val="single" w:sz="4" w:color="8C8C8C"/>
+              <w:right w:val="single" w:sz="4" w:color="8C8C8C"/>
+            </w:tcBorders>
+            <w:tcMar>
+              <w:top w:w="80" w:type="dxa"/>
+              <w:left w:w="120" w:type="dxa"/>
+              <w:bottom w:w="80" w:type="dxa"/>
+              <w:right w:w="120" w:type="dxa"/>
+            </w:tcMar>
+          </w:tcPr>
+          <w:p>
+            <w:r/>
+            <w:r>
+              <w:rPr>
+                <w:sz w:val="20"/>
+              </w:rPr>
+              <w:t>65.2% (40.5–72.1)</w:t>
+            </w:r>
+          </w:p>
+        </w:tc>
+        <w:tc>
+          <w:tcPr>
+            <w:tcW w:type="dxa" w:w="3009"/>
+            <w:tcBorders>
+              <w:top w:val="single" w:sz="4" w:color="8C8C8C"/>
+              <w:left w:val="single" w:sz="4" w:color="8C8C8C"/>
+              <w:bottom w:val="single" w:sz="4" w:color="8C8C8C"/>
+              <w:right w:val="single" w:sz="4" w:color="8C8C8C"/>
+            </w:tcBorders>
+            <w:tcMar>
+              <w:top w:w="80" w:type="dxa"/>
+              <w:left w:w="120" w:type="dxa"/>
+              <w:bottom w:w="80" w:type="dxa"/>
+              <w:right w:w="120" w:type="dxa"/>
+            </w:tcMar>
+          </w:tcPr>
+          <w:p>
+            <w:r/>
+            <w:r>
+              <w:rPr>
+                <w:sz w:val="20"/>
+              </w:rPr>
+              <w:t>57.2% (40.1–72.3)</w:t>
+            </w:r>
+          </w:p>
+        </w:tc>
+      </w:tr>
+    </w:tbl>
+    <w:p>
+      <w:pPr>
+        <w:spacing w:before="360" w:after="160"/>
+      </w:pPr>
+      <w:r>
+        <w:rPr>
+          <w:b/>
+          <w:sz w:val="24"/>
+        </w:rPr>
+        <w:t>B.3 NSUM under Alternative Adjustment-Factor Tiers</w:t>
+      </w:r>
+    </w:p>
+    <w:p>
+      <w:pPr>
+        <w:spacing w:after="120" w:line="276" w:lineRule="auto"/>
+      </w:pPr>
+      <w:r>
+        <w:t>Tables 4 and 7 above report MBSU NSUM estimates under three discrete (δ, τ) tiers — Unadjusted (δ = 1.0, τ = 1.0), Moderate (δ = 0.9, τ = 0.85), and Conservative (δ = 0.8, τ = 0.70). Conservative adjustments produce estimates approximately 1.8 times higher than Unadjusted; Moderate adjustments produce estimates approximately 1.3 times higher. Main-paper Figure 5 shows the Moderate-tier NSUM forest plot as a reference scenario; the headline NSUM result in the main paper is the continuous-τ sweep (main-paper Section 4.5; Figure ESM_4 Fig 1 above) rather than any single discrete tier. The discrete-tier comparison is retained in this ESM for direct comparability with the existing NSUM literature (Killworth et al. 1998; Maltiel et al. 2015; Feehan and Salganik 2016).</w:t>
+      </w:r>
+    </w:p>
+    <w:p>
+      <w:pPr>
+        <w:spacing w:before="360" w:after="160"/>
+      </w:pPr>
+      <w:r>
+        <w:rPr>
+          <w:b/>
+          <w:sz w:val="28"/>
+        </w:rPr>
+        <w:t>ESM_4 Section C. Survey Incentive Design and Literature</w:t>
+      </w:r>
+    </w:p>
+    <w:p>
+      <w:pPr>
+        <w:spacing w:after="120" w:line="276" w:lineRule="auto"/>
+      </w:pPr>
+      <w:r>
+        <w:t>This section provides full discussion of the survey incentive design and review of the supporting literature, summarised in one sentence in main-paper Section 3.1.</w:t>
+      </w:r>
+    </w:p>
+    <w:p>
+      <w:pPr>
+        <w:spacing w:after="120" w:line="276" w:lineRule="auto"/>
+      </w:pPr>
+      <w:r>
+        <w:t>We designed our survey incentive structure following established principles for web-based survey research, with particular attention to the specificities of incentive use within web-based surveys (Cobanoglu and Cobanoglu 2003). Following the principles of lottery use established by Brown, Schonfeld and Gordon (2006) and Laguilles, Williams and Saunders (2011), we designed our survey to encourage the maximum extent of participation by entering all respondents completing the questionnaire into a free prize draw for £150. Research suggests that a high lottery provides the most cost-effective incentive for obtaining complete responses (Gajic, Cameron and Hurley 2012). While using incentives to encourage participation would seem to be desirable, it is worth noting the potential downside of respondents fabricating responses to increase their remuneration (Robinson 2014). To minimise this risk, mobile phone numbers for each respondent and those whom they referred were collated, and each of these numbers was called by one of the authors of the paper to ascertain the veracity of the respondent as a domestic worker. The ethics of using survey incentives in the context of hidden, potentially vulnerable populations have been carefully considered in the RDS literature (Semaan et al. 2009; DeJong et al. 2009; Singer and Bossarte 2006); our incentive design follows the consensus recommendations of that literature.</w:t>
+      </w:r>
+    </w:p>
     <w:sectPr>
       <w:pgSz w:w="11906" w:h="16838"/>
       <w:pgMar w:top="1440" w:right="1440" w:bottom="1440" w:left="1440" w:header="708" w:footer="708" w:gutter="0"/>

</xml_diff>